<commit_message>
Otrosi 9840: comprador Nicolas, promesa 21-ago-2026, escritura a 21-oct o cuando saneado, $15M adelanto descrito; listo
Co-Authored-By: Claude Opus 4.8 <noreply@anthropic.com>
Claude-Session: https://claude.ai/code/session_01V3nTS2cxs4zGL1pJrFeNth
</commit_message>
<xml_diff>
--- a/flipping-02-el-tirol-3-apto-9840/Otrosi-Promesa-9840-DEFINITIVO.docx
+++ b/flipping-02-el-tirol-3-apto-9840/Otrosi-Promesa-9840-DEFINITIVO.docx
@@ -90,7 +90,7 @@
         <w:t xml:space="preserve">; y </w:t>
       </w:r>
       <w:r>
-        <w:t>[NOMBRE DEL PROMITENTE COMPRADOR]**, mayor de edad,</w:t>
+        <w:t>NICOLÁS MEJÍA ACEVEDO**, mayor de edad,</w:t>
       </w:r>
     </w:p>
     <w:p>
@@ -106,7 +106,7 @@
         <w:rPr>
           <w:b/>
         </w:rPr>
-        <w:t>[__________]</w:t>
+        <w:t>1.028.031.225</w:t>
       </w:r>
       <w:r>
         <w:t xml:space="preserve">, quien se denominará </w:t>
@@ -134,7 +134,7 @@
         <w:rPr>
           <w:b/>
         </w:rPr>
-        <w:t>[__] de [____] de 2026</w:t>
+        <w:t>21 de agosto de 2026</w:t>
       </w:r>
       <w:r>
         <w:t>, relacionado con</w:t>
@@ -196,26 +196,37 @@
     </w:p>
     <w:p>
       <w:r>
-        <w:t>de compraventa**, la cual se otorgará en la fecha que las partes acuerden una vez</w:t>
-      </w:r>
-    </w:p>
-    <w:p>
-      <w:r>
-        <w:t xml:space="preserve">culminado el saneamiento del folio </w:t>
+        <w:t>de compraventa</w:t>
       </w:r>
       <w:r>
         <w:rPr>
           <w:b/>
         </w:rPr>
-        <w:t>[y a más tardar el [__] de [____] de 2026]</w:t>
+        <w:t xml:space="preserve">. En consecuencia, esta se otorgará </w:t>
       </w:r>
       <w:r>
-        <w:t>,</w:t>
+        <w:t>el 21 de octubre de 2026**, o</w:t>
       </w:r>
     </w:p>
     <w:p>
       <w:r>
-        <w:t>quedando sin efecto cualquier fecha de escrituración fijada en la promesa original.</w:t>
+        <w:rPr>
+          <w:b/>
+        </w:rPr>
+        <w:t>en la fecha en que el folio quede saneado</w:t>
+      </w:r>
+      <w:r>
+        <w:t xml:space="preserve"> si el saneamiento se prolongara más</w:t>
+      </w:r>
+    </w:p>
+    <w:p>
+      <w:r>
+        <w:t>allá de dicha fecha —dado que actualmente se está demorando—, quedando **sin efecto</w:t>
+      </w:r>
+    </w:p>
+    <w:p>
+      <w:r>
+        <w:t>la fecha de escrituración inicialmente prevista** en la promesa.</w:t>
       </w:r>
     </w:p>
     <w:p>
@@ -425,15 +436,15 @@
         <w:rPr>
           <w:b/>
         </w:rPr>
-        <w:t>ya pagados con anterioridad</w:t>
+        <w:t>ya pagados</w:t>
       </w:r>
       <w:r>
-        <w:t xml:space="preserve"> por EL PROMITENTE COMPRADOR</w:t>
+        <w:t xml:space="preserve"> por EL PROMITENTE COMPRADOR como **adelanto</w:t>
       </w:r>
     </w:p>
     <w:p>
       <w:r>
-        <w:t xml:space="preserve">   *(abono previo — [confirmar fecha/forma])*.</w:t>
+        <w:t xml:space="preserve">   para la firma de la compraventa**.</w:t>
       </w:r>
     </w:p>
     <w:p>
@@ -559,7 +570,7 @@
         <w:rPr>
           <w:b/>
         </w:rPr>
-        <w:t>[__] de [____] de 2026</w:t>
+        <w:t>21 de agosto de 2026</w:t>
       </w:r>
       <w:r>
         <w:t>.</w:t>
@@ -567,7 +578,7 @@
     </w:p>
     <w:p>
       <w:r>
-        <w:t>En señal de conformidad, se firma en Medellín, a los **[__] días del mes de [____]</w:t>
+        <w:t>En señal de conformidad, se firma en Medellín, a los **25 días del mes de agosto</w:t>
       </w:r>
     </w:p>
     <w:p>
@@ -587,12 +598,12 @@
     </w:p>
     <w:p>
       <w:r>
-        <w:t>MARTHA LUCÍA MORALES ESPINAL                 [NOMBRE DEL PROMITENTE COMPRADOR]</w:t>
+        <w:t>MARTHA LUCÍA MORALES ESPINAL                 NICOLÁS MEJÍA ACEVEDO</w:t>
       </w:r>
     </w:p>
     <w:p>
       <w:r>
-        <w:t>C.C. No. 42.677.313                          C.C. No. [__________]</w:t>
+        <w:t>C.C. No. 42.677.313                          C.C. No. 1.028.031.225</w:t>
       </w:r>
     </w:p>
     <w:sectPr>

</xml_diff>

<commit_message>
Otrosi 9840: incluye a Luis Eduardo Chavarria como copromitente vendedor (conyuge cotitular por sociedad conyugal); tres firmas
Co-Authored-By: Claude Opus 4.8 <noreply@anthropic.com>
Claude-Session: https://claude.ai/code/session_01V3nTS2cxs4zGL1pJrFeNth
</commit_message>
<xml_diff>
--- a/flipping-02-el-tirol-3-apto-9840/Otrosi-Promesa-9840-DEFINITIVO.docx
+++ b/flipping-02-el-tirol-3-apto-9840/Otrosi-Promesa-9840-DEFINITIVO.docx
@@ -76,21 +76,16 @@
         <w:t>42.677.313</w:t>
       </w:r>
       <w:r>
-        <w:t>, quien para todos los efectos de este contrato se denominará **LA</w:t>
-      </w:r>
-    </w:p>
-    <w:p>
-      <w:r>
-        <w:t>PROMITENTE VENDEDORA</w:t>
+        <w:t xml:space="preserve">, y su cónyuge </w:t>
       </w:r>
       <w:r>
         <w:rPr>
           <w:b/>
         </w:rPr>
-        <w:t xml:space="preserve">; y </w:t>
+        <w:t>LUIS EDUARDO CHAVARRÍA CARVAJAL</w:t>
       </w:r>
       <w:r>
-        <w:t>NICOLÁS MEJÍA ACEVEDO**, mayor de edad,</w:t>
+        <w:t>, mayor de edad,</w:t>
       </w:r>
     </w:p>
     <w:p>
@@ -106,10 +101,80 @@
         <w:rPr>
           <w:b/>
         </w:rPr>
+        <w:t>70.576.777</w:t>
+      </w:r>
+      <w:r>
+        <w:t xml:space="preserve">, </w:t>
+      </w:r>
+      <w:r>
+        <w:rPr>
+          <w:b/>
+        </w:rPr>
+        <w:t>casados entre sí</w:t>
+      </w:r>
+      <w:r>
+        <w:t xml:space="preserve"> (matrimonio del 26 de noviembre de 1990)</w:t>
+      </w:r>
+    </w:p>
+    <w:p>
+      <w:r>
+        <w:t xml:space="preserve">y </w:t>
+      </w:r>
+      <w:r>
+        <w:rPr>
+          <w:b/>
+        </w:rPr>
+        <w:t>cotitulares</w:t>
+      </w:r>
+      <w:r>
+        <w:t xml:space="preserve"> del inmueble por pertenecer este a la </w:t>
+      </w:r>
+      <w:r>
+        <w:rPr>
+          <w:b/>
+        </w:rPr>
+        <w:t>sociedad conyugal</w:t>
+      </w:r>
+      <w:r>
+        <w:t>,</w:t>
+      </w:r>
+    </w:p>
+    <w:p>
+      <w:r>
+        <w:t xml:space="preserve">quienes conjuntamente se denominarán </w:t>
+      </w:r>
+      <w:r>
+        <w:rPr>
+          <w:b/>
+        </w:rPr>
+        <w:t>LOS PROMITENTES VENDEDORES</w:t>
+      </w:r>
+      <w:r>
+        <w:t>; y **NICOLÁS</w:t>
+      </w:r>
+    </w:p>
+    <w:p>
+      <w:r>
+        <w:t>MEJÍA ACEVEDO**, mayor de edad, domiciliado en el municipio de Medellín,</w:t>
+      </w:r>
+    </w:p>
+    <w:p>
+      <w:r>
+        <w:t xml:space="preserve">identificado con la cédula de ciudadanía número </w:t>
+      </w:r>
+      <w:r>
+        <w:rPr>
+          <w:b/>
+        </w:rPr>
         <w:t>1.028.031.225</w:t>
       </w:r>
       <w:r>
-        <w:t xml:space="preserve">, quien se denominará </w:t>
+        <w:t>, quien se</w:t>
+      </w:r>
+    </w:p>
+    <w:p>
+      <w:r>
+        <w:t xml:space="preserve">denominará </w:t>
       </w:r>
       <w:r>
         <w:rPr>
@@ -118,17 +183,12 @@
         <w:t>EL PROMITENTE COMPRADOR</w:t>
       </w:r>
       <w:r>
-        <w:t>; hemos</w:t>
+        <w:t>; hemos decidido de mutuo acuerdo modificar y</w:t>
       </w:r>
     </w:p>
     <w:p>
       <w:r>
-        <w:t>decidido de mutuo acuerdo modificar y adicionar el contrato de promesa de</w:t>
-      </w:r>
-    </w:p>
-    <w:p>
-      <w:r>
-        <w:t xml:space="preserve">compraventa suscrito entre las partes el </w:t>
+        <w:t xml:space="preserve">adicionar el contrato de promesa de compraventa suscrito el </w:t>
       </w:r>
       <w:r>
         <w:rPr>
@@ -137,22 +197,22 @@
         <w:t>21 de agosto de 2026</w:t>
       </w:r>
       <w:r>
-        <w:t>, relacionado con</w:t>
+        <w:t>,</w:t>
       </w:r>
     </w:p>
     <w:p>
       <w:r>
-        <w:t>el bien inmueble identificado con el **Folio de Matrícula Inmobiliaria número</w:t>
+        <w:t>relacionado con el bien inmueble identificado con el **Folio de Matrícula</w:t>
       </w:r>
     </w:p>
     <w:p>
       <w:r>
-        <w:t>01N-5433420** de la Oficina de Registro de Instrumentos Públicos de Medellín Norte</w:t>
+        <w:t>Inmobiliaria número 01N-5433420** de la Oficina de Registro de Instrumentos Públicos</w:t>
       </w:r>
     </w:p>
     <w:p>
       <w:r>
-        <w:t xml:space="preserve">(Apartamento </w:t>
+        <w:t xml:space="preserve">de Medellín Norte (Apartamento </w:t>
       </w:r>
       <w:r>
         <w:rPr>
@@ -161,12 +221,12 @@
         <w:t>9840</w:t>
       </w:r>
       <w:r>
-        <w:t>, Torre 7, Piso -2, urbanización El Tirol 3, área privada</w:t>
+        <w:t>, Torre 7, Piso -2, urbanización El Tirol 3,</w:t>
       </w:r>
     </w:p>
     <w:p>
       <w:r>
-        <w:t>45,95 m², coeficiente 0,148 %), en los siguientes términos:</w:t>
+        <w:t>área privada 45,95 m², coeficiente 0,148 %), en los siguientes términos:</w:t>
       </w:r>
     </w:p>
     <w:p>
@@ -174,29 +234,87 @@
         <w:rPr>
           <w:b/>
         </w:rPr>
-        <w:t>PRIMERA. MODIFICACIÓN DE LA FECHA DE LA ESCRITURA.</w:t>
+        <w:t>PRIMERA. COMPARECENCIA DEL CÓNYUGE COTITULAR.</w:t>
       </w:r>
       <w:r>
-        <w:t xml:space="preserve"> Las partes acuerdan, **de</w:t>
+        <w:t xml:space="preserve"> El señor **LUIS EDUARDO CHAVARRÍA</w:t>
       </w:r>
     </w:p>
     <w:p>
       <w:r>
-        <w:t>mutuo acuerdo</w:t>
+        <w:t>CARVAJAL</w:t>
       </w:r>
       <w:r>
         <w:rPr>
           <w:b/>
         </w:rPr>
-        <w:t xml:space="preserve">, modificar la fecha para el otorgamiento de la </w:t>
+        <w:t xml:space="preserve"> comparece y se </w:t>
       </w:r>
       <w:r>
-        <w:t>escritura pública</w:t>
+        <w:t>adhiere a la promesa como COPROMITENTE VENDEDOR**, en su</w:t>
       </w:r>
     </w:p>
     <w:p>
       <w:r>
-        <w:t>de compraventa</w:t>
+        <w:t xml:space="preserve">calidad de </w:t>
+      </w:r>
+      <w:r>
+        <w:rPr>
+          <w:b/>
+        </w:rPr>
+        <w:t>cónyuge</w:t>
+      </w:r>
+      <w:r>
+        <w:t xml:space="preserve"> de MARTHA LUCÍA MORALES ESPINAL y </w:t>
+      </w:r>
+      <w:r>
+        <w:rPr>
+          <w:b/>
+        </w:rPr>
+        <w:t>cotitular</w:t>
+      </w:r>
+      <w:r>
+        <w:t xml:space="preserve"> del inmueble</w:t>
+      </w:r>
+    </w:p>
+    <w:p>
+      <w:r>
+        <w:t xml:space="preserve">por integrar este la </w:t>
+      </w:r>
+      <w:r>
+        <w:rPr>
+          <w:b/>
+        </w:rPr>
+        <w:t>sociedad conyugal</w:t>
+      </w:r>
+      <w:r>
+        <w:t>; en tal virtud **autoriza y se obliga a la</w:t>
+      </w:r>
+    </w:p>
+    <w:p>
+      <w:r>
+        <w:t>venta** en los mismos términos aquí pactados.</w:t>
+      </w:r>
+    </w:p>
+    <w:p>
+      <w:r>
+        <w:rPr>
+          <w:b/>
+        </w:rPr>
+        <w:t>SEGUNDA. MODIFICACIÓN DE LA FECHA DE LA ESCRITURA.</w:t>
+      </w:r>
+      <w:r>
+        <w:t xml:space="preserve"> Las partes acuerdan, de mutuo</w:t>
+      </w:r>
+    </w:p>
+    <w:p>
+      <w:r>
+        <w:t>acuerdo, modificar la fecha para el otorgamiento de la **escritura pública de</w:t>
+      </w:r>
+    </w:p>
+    <w:p>
+      <w:r>
+        <w:t>compraventa</w:t>
       </w:r>
       <w:r>
         <w:rPr>
@@ -205,7 +323,31 @@
         <w:t xml:space="preserve">. En consecuencia, esta se otorgará </w:t>
       </w:r>
       <w:r>
-        <w:t>el 21 de octubre de 2026**, o</w:t>
+        <w:t>el 21 de octubre de 2026</w:t>
+      </w:r>
+      <w:r>
+        <w:rPr>
+          <w:b/>
+        </w:rPr>
+        <w:t xml:space="preserve">, o </w:t>
+      </w:r>
+      <w:r>
+        <w:t>en</w:t>
+      </w:r>
+    </w:p>
+    <w:p>
+      <w:r>
+        <w:t>la fecha en que el folio quede saneado** si el saneamiento se prolongara más allá de</w:t>
+      </w:r>
+    </w:p>
+    <w:p>
+      <w:r>
+        <w:t>dicha fecha —dado que actualmente se está demorando—, quedando **sin efecto la fecha</w:t>
+      </w:r>
+    </w:p>
+    <w:p>
+      <w:r>
+        <w:t>de escrituración inicialmente prevista** en la promesa.</w:t>
       </w:r>
     </w:p>
     <w:p>
@@ -213,28 +355,7 @@
         <w:rPr>
           <w:b/>
         </w:rPr>
-        <w:t>en la fecha en que el folio quede saneado</w:t>
-      </w:r>
-      <w:r>
-        <w:t xml:space="preserve"> si el saneamiento se prolongara más</w:t>
-      </w:r>
-    </w:p>
-    <w:p>
-      <w:r>
-        <w:t>allá de dicha fecha —dado que actualmente se está demorando—, quedando **sin efecto</w:t>
-      </w:r>
-    </w:p>
-    <w:p>
-      <w:r>
-        <w:t>la fecha de escrituración inicialmente prevista** en la promesa.</w:t>
-      </w:r>
-    </w:p>
-    <w:p>
-      <w:r>
-        <w:rPr>
-          <w:b/>
-        </w:rPr>
-        <w:t>SEGUNDA. LEVANTAMIENTOS Y SANEAMIENTO DEL FOLIO (CONDICIÓN).</w:t>
+        <w:t>TERCERA. LEVANTAMIENTOS Y SANEAMIENTO DEL FOLIO (CONDICIÓN).</w:t>
       </w:r>
       <w:r>
         <w:t xml:space="preserve"> Como </w:t>
@@ -248,12 +369,12 @@
     </w:p>
     <w:p>
       <w:r>
-        <w:t>para el otorgamiento de la escritura de compraventa, LA PROMITENTE VENDEDORA se</w:t>
+        <w:t>para el otorgamiento de la escritura de compraventa, LOS PROMITENTES VENDEDORES se</w:t>
       </w:r>
     </w:p>
     <w:p>
       <w:r>
-        <w:t xml:space="preserve">obliga a dejar el folio </w:t>
+        <w:t xml:space="preserve">obligan a dejar el folio </w:t>
       </w:r>
       <w:r>
         <w:rPr>
@@ -298,7 +419,7 @@
     </w:p>
     <w:p>
       <w:r>
-        <w:t xml:space="preserve">     de LA PROMITENTE VENDEDORA y de </w:t>
+        <w:t xml:space="preserve">     de MARTHA LUCÍA MORALES ESPINAL y de </w:t>
       </w:r>
       <w:r>
         <w:rPr>
@@ -326,7 +447,16 @@
     </w:p>
     <w:p>
       <w:r>
-        <w:t xml:space="preserve">     comparecencia de LA PROMITENTE VENDEDORA y del señor **LUIS EDUARDO CHAVARRÍA</w:t>
+        <w:t xml:space="preserve">     comparecencia de </w:t>
+      </w:r>
+      <w:r>
+        <w:rPr>
+          <w:b/>
+        </w:rPr>
+        <w:t>MARTHA LUCÍA MORALES ESPINAL</w:t>
+      </w:r>
+      <w:r>
+        <w:t xml:space="preserve"> y de **LUIS EDUARDO CHAVARRÍA</w:t>
       </w:r>
     </w:p>
     <w:p>
@@ -386,12 +516,12 @@
         <w:t>inscritos en la ORIP</w:t>
       </w:r>
       <w:r>
-        <w:t xml:space="preserve"> para</w:t>
+        <w:t xml:space="preserve"> para que</w:t>
       </w:r>
     </w:p>
     <w:p>
       <w:r>
-        <w:t>que el folio quede limpio antes de la escritura de compraventa.</w:t>
+        <w:t>el folio quede limpio antes de la escritura de compraventa.</w:t>
       </w:r>
     </w:p>
     <w:p>
@@ -399,7 +529,7 @@
         <w:rPr>
           <w:b/>
         </w:rPr>
-        <w:t>TERCERA. PRECIO, ABONOS Y FORMA DE PAGO.</w:t>
+        <w:t>CUARTA. PRECIO, ABONOS Y FORMA DE PAGO.</w:t>
       </w:r>
       <w:r>
         <w:t xml:space="preserve"> El precio total de la compraventa es la</w:t>
@@ -458,26 +588,58 @@
         <w:t>$58.000.000</w:t>
       </w:r>
       <w:r>
-        <w:t xml:space="preserve"> M/CTE que se entregan a LA PROMITENTE VENDEDORA el **25 de agosto</w:t>
-      </w:r>
-    </w:p>
-    <w:p>
-      <w:r>
-        <w:t xml:space="preserve">   de 2026</w:t>
+        <w:t xml:space="preserve"> M/CTE que se entregan a </w:t>
       </w:r>
       <w:r>
         <w:rPr>
           <w:b/>
         </w:rPr>
-        <w:t xml:space="preserve">, como </w:t>
+        <w:t>LOS PROMITENTES VENDEDORES</w:t>
       </w:r>
       <w:r>
-        <w:t>adelanto/abono a la compra**, el mismo día de los</w:t>
+        <w:t xml:space="preserve"> —recibidos</w:t>
       </w:r>
     </w:p>
     <w:p>
       <w:r>
-        <w:t xml:space="preserve">   levantamientos (cláusula SEGUNDA).</w:t>
+        <w:t xml:space="preserve">   por la señora </w:t>
+      </w:r>
+      <w:r>
+        <w:rPr>
+          <w:b/>
+        </w:rPr>
+        <w:t>MARTHA LUCÍA MORALES ESPINAL</w:t>
+      </w:r>
+      <w:r>
+        <w:t xml:space="preserve">— el </w:t>
+      </w:r>
+      <w:r>
+        <w:rPr>
+          <w:b/>
+        </w:rPr>
+        <w:t>25 de agosto de 2026</w:t>
+      </w:r>
+      <w:r>
+        <w:t>, como</w:t>
+      </w:r>
+    </w:p>
+    <w:p>
+      <w:r>
+        <w:t xml:space="preserve">   </w:t>
+      </w:r>
+      <w:r>
+        <w:rPr>
+          <w:b/>
+        </w:rPr>
+        <w:t>adelanto/abono a la compra</w:t>
+      </w:r>
+      <w:r>
+        <w:t>, el mismo día de los levantamientos (cláusula</w:t>
+      </w:r>
+    </w:p>
+    <w:p>
+      <w:r>
+        <w:t xml:space="preserve">   TERCERA).</w:t>
       </w:r>
     </w:p>
     <w:p>
@@ -510,13 +672,13 @@
     </w:p>
     <w:p>
       <w:r>
-        <w:t xml:space="preserve">LA PROMITENTE VENDEDORA </w:t>
+        <w:t xml:space="preserve">LOS PROMITENTES VENDEDORES </w:t>
       </w:r>
       <w:r>
         <w:rPr>
           <w:b/>
         </w:rPr>
-        <w:t>declara y reconoce</w:t>
+        <w:t>declaran y reconocen</w:t>
       </w:r>
       <w:r>
         <w:t xml:space="preserve"> haber recibido a satisfacción los</w:t>
@@ -538,12 +700,12 @@
     </w:p>
     <w:p>
       <w:r>
-        <w:t>partes conservarán los soportes de pago. El saldo (numeral 3) se paga contra la</w:t>
+        <w:t>partes conservarán los soportes de pago. El saldo (numeral 3) se paga contra la firma</w:t>
       </w:r>
     </w:p>
     <w:p>
       <w:r>
-        <w:t>firma de la escritura, momento en el cual el inmueble se transfiere a EL PROMITENTE</w:t>
+        <w:t>de la escritura, momento en el cual el inmueble se transfiere a EL PROMITENTE</w:t>
       </w:r>
     </w:p>
     <w:p>
@@ -556,7 +718,7 @@
         <w:rPr>
           <w:b/>
         </w:rPr>
-        <w:t>CUARTA. VIGENCIA.</w:t>
+        <w:t>QUINTA. VIGENCIA.</w:t>
       </w:r>
       <w:r>
         <w:t xml:space="preserve"> En todo lo demás continúa vigente el contrato de promesa de</w:t>
@@ -578,32 +740,73 @@
     </w:p>
     <w:p>
       <w:r>
-        <w:t>En señal de conformidad, se firma en Medellín, a los **25 días del mes de agosto</w:t>
+        <w:t>En señal de conformidad, se firma en Medellín, a los **25 días del mes de agosto de</w:t>
       </w:r>
     </w:p>
     <w:p>
       <w:r>
-        <w:t>de 2026**, en dos (2) ejemplares de igual valor y tenor.</w:t>
+        <w:t>2026**, en tres (3) ejemplares de igual valor y tenor.</w:t>
       </w:r>
     </w:p>
     <w:p>
       <w:r>
-        <w:t>LA PROMITENTE VENDEDORA,                      EL PROMITENTE COMPRADOR,</w:t>
+        <w:rPr>
+          <w:b/>
+        </w:rPr>
+        <w:t>LOS PROMITENTES VENDEDORES,</w:t>
       </w:r>
     </w:p>
     <w:p>
       <w:r>
-        <w:t>_____________________________               _____________________________</w:t>
+        <w:t>_____________________________</w:t>
       </w:r>
     </w:p>
     <w:p>
       <w:r>
-        <w:t>MARTHA LUCÍA MORALES ESPINAL                 NICOLÁS MEJÍA ACEVEDO</w:t>
+        <w:t>MARTHA LUCÍA MORALES ESPINAL</w:t>
       </w:r>
     </w:p>
     <w:p>
       <w:r>
-        <w:t>C.C. No. 42.677.313                          C.C. No. 1.028.031.225</w:t>
+        <w:t>C.C. No. 42.677.313</w:t>
+      </w:r>
+    </w:p>
+    <w:p>
+      <w:r>
+        <w:t>_____________________________</w:t>
+      </w:r>
+    </w:p>
+    <w:p>
+      <w:r>
+        <w:t>LUIS EDUARDO CHAVARRÍA CARVAJAL</w:t>
+      </w:r>
+    </w:p>
+    <w:p>
+      <w:r>
+        <w:t>C.C. No. 70.576.777</w:t>
+      </w:r>
+    </w:p>
+    <w:p>
+      <w:r>
+        <w:rPr>
+          <w:b/>
+        </w:rPr>
+        <w:t>EL PROMITENTE COMPRADOR,</w:t>
+      </w:r>
+    </w:p>
+    <w:p>
+      <w:r>
+        <w:t>_____________________________</w:t>
+      </w:r>
+    </w:p>
+    <w:p>
+      <w:r>
+        <w:t>NICOLÁS MEJÍA ACEVEDO</w:t>
+      </w:r>
+    </w:p>
+    <w:p>
+      <w:r>
+        <w:t>C.C. No. 1.028.031.225</w:t>
       </w:r>
     </w:p>
     <w:sectPr>

</xml_diff>